<commit_message>
fix date; rename research
</commit_message>
<xml_diff>
--- a/cv.docx
+++ b/cv.docx
@@ -1383,6 +1383,115 @@
         </w:rPr>
         <w:t>Embodiment Adaptation in Locomotion</w:t>
       </w:r>
+      <w:r>
+        <w:rPr>
+          <w:rFonts w:hint="default" w:ascii="Times New Roman" w:hAnsi="Times New Roman" w:cs="Times New Roman"/>
+          <w:b/>
+          <w:bCs/>
+          <w:sz w:val="20"/>
+          <w:szCs w:val="20"/>
+          <w:lang w:val="en-US" w:eastAsia="zh-CN"/>
+        </w:rPr>
+        <w:tab/>
+        <w:t/>
+      </w:r>
+      <w:r>
+        <w:rPr>
+          <w:rFonts w:hint="default" w:ascii="Times New Roman" w:hAnsi="Times New Roman" w:cs="Times New Roman"/>
+          <w:b/>
+          <w:bCs/>
+          <w:sz w:val="20"/>
+          <w:szCs w:val="20"/>
+          <w:lang w:val="en-US" w:eastAsia="zh-CN"/>
+        </w:rPr>
+        <w:tab/>
+        <w:t/>
+      </w:r>
+      <w:r>
+        <w:rPr>
+          <w:rFonts w:hint="default" w:ascii="Times New Roman" w:hAnsi="Times New Roman" w:cs="Times New Roman"/>
+          <w:b/>
+          <w:bCs/>
+          <w:sz w:val="20"/>
+          <w:szCs w:val="20"/>
+          <w:lang w:val="en-US" w:eastAsia="zh-CN"/>
+        </w:rPr>
+        <w:tab/>
+        <w:t/>
+      </w:r>
+      <w:r>
+        <w:rPr>
+          <w:rFonts w:hint="default" w:ascii="Times New Roman" w:hAnsi="Times New Roman" w:cs="Times New Roman"/>
+          <w:b/>
+          <w:bCs/>
+          <w:sz w:val="20"/>
+          <w:szCs w:val="20"/>
+          <w:lang w:val="en-US" w:eastAsia="zh-CN"/>
+        </w:rPr>
+        <w:tab/>
+        <w:t/>
+      </w:r>
+      <w:r>
+        <w:rPr>
+          <w:rFonts w:hint="default" w:ascii="Times New Roman" w:hAnsi="Times New Roman" w:cs="Times New Roman"/>
+          <w:b/>
+          <w:bCs/>
+          <w:sz w:val="20"/>
+          <w:szCs w:val="20"/>
+          <w:lang w:val="en-US" w:eastAsia="zh-CN"/>
+        </w:rPr>
+        <w:tab/>
+        <w:t/>
+      </w:r>
+      <w:r>
+        <w:rPr>
+          <w:rFonts w:hint="default" w:ascii="Times New Roman" w:hAnsi="Times New Roman" w:cs="Times New Roman"/>
+          <w:b/>
+          <w:bCs/>
+          <w:sz w:val="20"/>
+          <w:szCs w:val="20"/>
+          <w:lang w:val="en-US" w:eastAsia="zh-CN"/>
+        </w:rPr>
+        <w:tab/>
+        <w:t/>
+      </w:r>
+      <w:r>
+        <w:rPr>
+          <w:rFonts w:hint="default" w:ascii="Times New Roman" w:hAnsi="Times New Roman" w:cs="Times New Roman"/>
+          <w:b/>
+          <w:bCs/>
+          <w:sz w:val="20"/>
+          <w:szCs w:val="20"/>
+          <w:lang w:val="en-US" w:eastAsia="zh-CN"/>
+        </w:rPr>
+        <w:tab/>
+        <w:t/>
+      </w:r>
+      <w:r>
+        <w:rPr>
+          <w:rFonts w:hint="default" w:ascii="Times New Roman" w:hAnsi="Times New Roman" w:cs="Times New Roman"/>
+          <w:b/>
+          <w:bCs/>
+          <w:sz w:val="20"/>
+          <w:szCs w:val="20"/>
+          <w:lang w:val="en-US" w:eastAsia="zh-CN"/>
+        </w:rPr>
+        <w:tab/>
+        <w:t xml:space="preserve">         </w:t>
+      </w:r>
+      <w:bookmarkStart w:id="1" w:name="_GoBack"/>
+      <w:bookmarkEnd w:id="1"/>
+      <w:r>
+        <w:rPr>
+          <w:rFonts w:hint="default" w:ascii="Times New Roman" w:hAnsi="Times New Roman" w:cs="Times New Roman"/>
+          <w:b/>
+          <w:bCs/>
+          <w:sz w:val="20"/>
+          <w:szCs w:val="20"/>
+          <w:lang w:val="en-US" w:eastAsia="zh-CN"/>
+        </w:rPr>
+        <w:t>04/2025-Present</w:t>
+      </w:r>
     </w:p>
     <w:p>
       <w:pPr>
@@ -1556,17 +1665,6 @@
           <w:lang w:val="en-US" w:eastAsia="zh-CN" w:bidi="ar-SA"/>
         </w:rPr>
         <w:t xml:space="preserve">         </w:t>
-      </w:r>
-      <w:r>
-        <w:rPr>
-          <w:rFonts w:hint="default" w:ascii="Times New Roman" w:hAnsi="Times New Roman" w:cs="Times New Roman"/>
-          <w:b/>
-          <w:bCs/>
-          <w:sz w:val="20"/>
-          <w:szCs w:val="20"/>
-          <w:lang w:val="en-US" w:eastAsia="zh-CN"/>
-        </w:rPr>
-        <w:t>04/2025-Present</w:t>
       </w:r>
     </w:p>
     <w:p>
@@ -1661,10 +1759,30 @@
           <w:szCs w:val="20"/>
           <w:lang w:val="en-US" w:eastAsia="zh-CN"/>
         </w:rPr>
-        <w:t>Large-scale Embodiment</w:t>
-      </w:r>
-      <w:bookmarkStart w:id="1" w:name="_GoBack"/>
-      <w:bookmarkEnd w:id="1"/>
+        <w:t xml:space="preserve">Large-scale Embodiment </w:t>
+      </w:r>
+      <w:r>
+        <w:rPr>
+          <w:rFonts w:hint="default" w:ascii="Times New Roman" w:hAnsi="Times New Roman" w:cs="Times New Roman"/>
+          <w:b/>
+          <w:bCs/>
+          <w:sz w:val="20"/>
+          <w:szCs w:val="20"/>
+          <w:lang w:val="en-US" w:eastAsia="zh-CN"/>
+        </w:rPr>
+        <w:t>Scaling Law in Robot Locomotion</w:t>
+      </w:r>
+      <w:r>
+        <w:rPr>
+          <w:rFonts w:ascii="Times New Roman" w:hAnsi="Times New Roman" w:cs="Times New Roman"/>
+          <w:b/>
+          <w:bCs/>
+          <w:sz w:val="20"/>
+          <w:szCs w:val="20"/>
+          <w:lang w:eastAsia="zh-Hans"/>
+        </w:rPr>
+        <w:t xml:space="preserve">             </w:t>
+      </w:r>
       <w:r>
         <w:rPr>
           <w:rFonts w:hint="eastAsia" w:ascii="Times New Roman" w:hAnsi="Times New Roman" w:cs="Times New Roman"/>
@@ -1674,18 +1792,18 @@
           <w:szCs w:val="20"/>
           <w:lang w:val="en-US" w:eastAsia="zh-CN"/>
         </w:rPr>
-        <w:t xml:space="preserve"> </w:t>
-      </w:r>
-      <w:r>
-        <w:rPr>
-          <w:rFonts w:hint="default" w:ascii="Times New Roman" w:hAnsi="Times New Roman" w:cs="Times New Roman"/>
+        <w:tab/>
+      </w:r>
+      <w:r>
+        <w:rPr>
+          <w:rFonts w:hint="eastAsia" w:ascii="Times New Roman" w:hAnsi="Times New Roman" w:cs="Times New Roman"/>
           <w:b/>
           <w:bCs/>
           <w:sz w:val="20"/>
           <w:szCs w:val="20"/>
           <w:lang w:val="en-US" w:eastAsia="zh-CN"/>
         </w:rPr>
-        <w:t>Scaling Law</w:t>
+        <w:t xml:space="preserve">   </w:t>
       </w:r>
       <w:r>
         <w:rPr>
@@ -1696,95 +1814,7 @@
           <w:szCs w:val="20"/>
           <w:lang w:eastAsia="zh-Hans"/>
         </w:rPr>
-        <w:t xml:space="preserve"> </w:t>
-      </w:r>
-      <w:r>
-        <w:rPr>
-          <w:rFonts w:hint="default" w:ascii="Times New Roman" w:hAnsi="Times New Roman" w:cs="Times New Roman"/>
-          <w:b/>
-          <w:bCs/>
-          <w:sz w:val="20"/>
-          <w:szCs w:val="20"/>
-          <w:lang w:val="en-US" w:eastAsia="zh-Hans"/>
-        </w:rPr>
-        <w:t>Discovery</w:t>
-      </w:r>
-      <w:r>
-        <w:rPr>
-          <w:rFonts w:ascii="Times New Roman" w:hAnsi="Times New Roman" w:cs="Times New Roman"/>
-          <w:b/>
-          <w:bCs/>
-          <w:sz w:val="20"/>
-          <w:szCs w:val="20"/>
-          <w:lang w:eastAsia="zh-Hans"/>
-        </w:rPr>
-        <w:t xml:space="preserve">             </w:t>
-      </w:r>
-      <w:r>
-        <w:rPr>
-          <w:rFonts w:hint="eastAsia" w:ascii="Times New Roman" w:hAnsi="Times New Roman" w:cs="Times New Roman"/>
-          <w:b/>
-          <w:bCs/>
-          <w:sz w:val="20"/>
-          <w:szCs w:val="20"/>
-          <w:lang w:val="en-US" w:eastAsia="zh-CN"/>
-        </w:rPr>
-        <w:tab/>
-      </w:r>
-      <w:r>
-        <w:rPr>
-          <w:rFonts w:hint="eastAsia" w:ascii="Times New Roman" w:hAnsi="Times New Roman" w:cs="Times New Roman"/>
-          <w:b/>
-          <w:bCs/>
-          <w:sz w:val="20"/>
-          <w:szCs w:val="20"/>
-          <w:lang w:val="en-US" w:eastAsia="zh-CN"/>
-        </w:rPr>
-        <w:t xml:space="preserve">   </w:t>
-      </w:r>
-      <w:r>
-        <w:rPr>
-          <w:rFonts w:ascii="Times New Roman" w:hAnsi="Times New Roman" w:cs="Times New Roman"/>
-          <w:b/>
-          <w:bCs/>
-          <w:sz w:val="20"/>
-          <w:szCs w:val="20"/>
-          <w:lang w:eastAsia="zh-Hans"/>
-        </w:rPr>
-        <w:t xml:space="preserve">                                                               </w:t>
-      </w:r>
-      <w:r>
-        <w:rPr>
-          <w:rFonts w:hint="default" w:ascii="Times New Roman" w:hAnsi="Times New Roman" w:cs="Times New Roman"/>
-          <w:b/>
-          <w:bCs/>
-          <w:sz w:val="20"/>
-          <w:szCs w:val="20"/>
-          <w:lang w:val="en-US" w:eastAsia="zh-Hans"/>
-        </w:rPr>
-        <w:t xml:space="preserve">   </w:t>
-      </w:r>
-      <w:r>
-        <w:rPr>
-          <w:rFonts w:hint="default" w:ascii="Times New Roman" w:hAnsi="Times New Roman" w:cs="Times New Roman"/>
-          <w:b/>
-          <w:bCs/>
-          <w:sz w:val="20"/>
-          <w:szCs w:val="20"/>
-          <w:lang w:val="en-US" w:eastAsia="zh-Hans"/>
-        </w:rPr>
-        <w:tab/>
-      </w:r>
-      <w:r>
-        <w:rPr>
-          <w:rFonts w:hint="default" w:ascii="Times New Roman" w:hAnsi="Times New Roman" w:cs="Times New Roman"/>
-          <w:b/>
-          <w:bCs/>
-          <w:sz w:val="20"/>
-          <w:szCs w:val="20"/>
-          <w:lang w:val="en-US" w:eastAsia="zh-Hans"/>
-        </w:rPr>
-        <w:t xml:space="preserve">        </w:t>
+        <w:t xml:space="preserve">                                                 </w:t>
       </w:r>
       <w:r>
         <w:rPr>
@@ -2226,7 +2256,40 @@
           <w:szCs w:val="20"/>
           <w:lang w:eastAsia="zh-Hans"/>
         </w:rPr>
-        <w:t xml:space="preserve">Hexopod Robot Manipulation with Reinforcement Learning                                                                              </w:t>
+        <w:t xml:space="preserve">Hexopod Robot </w:t>
+      </w:r>
+      <w:r>
+        <w:rPr>
+          <w:rFonts w:hint="default" w:ascii="Times New Roman" w:hAnsi="Times New Roman" w:cs="Times New Roman"/>
+          <w:b/>
+          <w:bCs/>
+          <w:sz w:val="20"/>
+          <w:szCs w:val="20"/>
+          <w:lang w:val="en-US" w:eastAsia="zh-Hans"/>
+        </w:rPr>
+        <w:t xml:space="preserve">Locomotion skills </w:t>
+      </w:r>
+      <w:r>
+        <w:rPr>
+          <w:rFonts w:ascii="Times New Roman" w:hAnsi="Times New Roman" w:cs="Times New Roman"/>
+          <w:b/>
+          <w:bCs/>
+          <w:sz w:val="20"/>
+          <w:szCs w:val="20"/>
+          <w:lang w:eastAsia="zh-Hans"/>
+        </w:rPr>
+        <w:t xml:space="preserve">with Reinforcement Learning                                                                 </w:t>
+      </w:r>
+      <w:r>
+        <w:rPr>
+          <w:rFonts w:hint="default" w:ascii="Times New Roman" w:hAnsi="Times New Roman" w:cs="Times New Roman"/>
+          <w:b/>
+          <w:bCs/>
+          <w:sz w:val="20"/>
+          <w:szCs w:val="20"/>
+          <w:lang w:val="en-US" w:eastAsia="zh-Hans"/>
+        </w:rPr>
+        <w:t xml:space="preserve">       </w:t>
       </w:r>
       <w:r>
         <w:rPr>

</xml_diff>